<commit_message>
add chapter 2 and structure for chapter 3, 4, and 5
</commit_message>
<xml_diff>
--- a/docs/deliverables/3.3/Deliverable 3-3 Final Project - Submission.docx
+++ b/docs/deliverables/3.3/Deliverable 3-3 Final Project - Submission.docx
@@ -311,7 +311,7 @@
           <w:r>
             <w:fldChar w:fldCharType="separate"/>
           </w:r>
-          <w:hyperlink w:anchor="_Toc225674571" w:history="1">
+          <w:hyperlink w:anchor="_Toc225677378" w:history="1">
             <w:r>
               <w:rPr>
                 <w:rStyle w:val="Hyperlink"/>
@@ -355,7 +355,7 @@
                 <w:noProof/>
                 <w:webHidden/>
               </w:rPr>
-              <w:instrText xml:space="preserve"> PAGEREF _Toc225674571 \h </w:instrText>
+              <w:instrText xml:space="preserve"> PAGEREF _Toc225677378 \h </w:instrText>
             </w:r>
             <w:r>
               <w:rPr>
@@ -401,7 +401,7 @@
               <w14:ligatures w14:val="standardContextual"/>
             </w:rPr>
           </w:pPr>
-          <w:hyperlink w:anchor="_Toc225674572" w:history="1">
+          <w:hyperlink w:anchor="_Toc225677379" w:history="1">
             <w:r>
               <w:rPr>
                 <w:rStyle w:val="Hyperlink"/>
@@ -445,7 +445,7 @@
                 <w:noProof/>
                 <w:webHidden/>
               </w:rPr>
-              <w:instrText xml:space="preserve"> PAGEREF _Toc225674572 \h </w:instrText>
+              <w:instrText xml:space="preserve"> PAGEREF _Toc225677379 \h </w:instrText>
             </w:r>
             <w:r>
               <w:rPr>
@@ -466,6 +466,186 @@
                 <w:webHidden/>
               </w:rPr>
               <w:t>2</w:t>
+            </w:r>
+            <w:r>
+              <w:rPr>
+                <w:noProof/>
+                <w:webHidden/>
+              </w:rPr>
+              <w:fldChar w:fldCharType="end"/>
+            </w:r>
+          </w:hyperlink>
+        </w:p>
+        <w:p>
+          <w:pPr>
+            <w:pStyle w:val="TOC2"/>
+            <w:tabs>
+              <w:tab w:val="left" w:pos="1440"/>
+              <w:tab w:val="right" w:leader="dot" w:pos="9019"/>
+            </w:tabs>
+            <w:rPr>
+              <w:rFonts w:asciiTheme="minorHAnsi" w:eastAsiaTheme="minorEastAsia" w:hAnsiTheme="minorHAnsi" w:cstheme="minorBidi"/>
+              <w:noProof/>
+              <w:kern w:val="2"/>
+              <w:lang w:val="en-CA"/>
+              <w14:ligatures w14:val="standardContextual"/>
+            </w:rPr>
+          </w:pPr>
+          <w:hyperlink w:anchor="_Toc225677380" w:history="1">
+            <w:r>
+              <w:rPr>
+                <w:rStyle w:val="Hyperlink"/>
+                <w:noProof/>
+              </w:rPr>
+              <w:t>2.1</w:t>
+            </w:r>
+            <w:r>
+              <w:rPr>
+                <w:rFonts w:asciiTheme="minorHAnsi" w:eastAsiaTheme="minorEastAsia" w:hAnsiTheme="minorHAnsi" w:cstheme="minorBidi"/>
+                <w:noProof/>
+                <w:kern w:val="2"/>
+                <w:lang w:val="en-CA"/>
+                <w14:ligatures w14:val="standardContextual"/>
+              </w:rPr>
+              <w:tab/>
+            </w:r>
+            <w:r>
+              <w:rPr>
+                <w:rStyle w:val="Hyperlink"/>
+                <w:noProof/>
+              </w:rPr>
+              <w:t>Functional Requirements</w:t>
+            </w:r>
+            <w:r>
+              <w:rPr>
+                <w:noProof/>
+                <w:webHidden/>
+              </w:rPr>
+              <w:tab/>
+            </w:r>
+            <w:r>
+              <w:rPr>
+                <w:noProof/>
+                <w:webHidden/>
+              </w:rPr>
+              <w:fldChar w:fldCharType="begin"/>
+            </w:r>
+            <w:r>
+              <w:rPr>
+                <w:noProof/>
+                <w:webHidden/>
+              </w:rPr>
+              <w:instrText xml:space="preserve"> PAGEREF _Toc225677380 \h </w:instrText>
+            </w:r>
+            <w:r>
+              <w:rPr>
+                <w:noProof/>
+                <w:webHidden/>
+              </w:rPr>
+            </w:r>
+            <w:r>
+              <w:rPr>
+                <w:noProof/>
+                <w:webHidden/>
+              </w:rPr>
+              <w:fldChar w:fldCharType="separate"/>
+            </w:r>
+            <w:r>
+              <w:rPr>
+                <w:noProof/>
+                <w:webHidden/>
+              </w:rPr>
+              <w:t>2</w:t>
+            </w:r>
+            <w:r>
+              <w:rPr>
+                <w:noProof/>
+                <w:webHidden/>
+              </w:rPr>
+              <w:fldChar w:fldCharType="end"/>
+            </w:r>
+          </w:hyperlink>
+        </w:p>
+        <w:p>
+          <w:pPr>
+            <w:pStyle w:val="TOC2"/>
+            <w:tabs>
+              <w:tab w:val="left" w:pos="1440"/>
+              <w:tab w:val="right" w:leader="dot" w:pos="9019"/>
+            </w:tabs>
+            <w:rPr>
+              <w:rFonts w:asciiTheme="minorHAnsi" w:eastAsiaTheme="minorEastAsia" w:hAnsiTheme="minorHAnsi" w:cstheme="minorBidi"/>
+              <w:noProof/>
+              <w:kern w:val="2"/>
+              <w:lang w:val="en-CA"/>
+              <w14:ligatures w14:val="standardContextual"/>
+            </w:rPr>
+          </w:pPr>
+          <w:hyperlink w:anchor="_Toc225677381" w:history="1">
+            <w:r>
+              <w:rPr>
+                <w:rStyle w:val="Hyperlink"/>
+                <w:noProof/>
+              </w:rPr>
+              <w:t>2.2</w:t>
+            </w:r>
+            <w:r>
+              <w:rPr>
+                <w:rFonts w:asciiTheme="minorHAnsi" w:eastAsiaTheme="minorEastAsia" w:hAnsiTheme="minorHAnsi" w:cstheme="minorBidi"/>
+                <w:noProof/>
+                <w:kern w:val="2"/>
+                <w:lang w:val="en-CA"/>
+                <w14:ligatures w14:val="standardContextual"/>
+              </w:rPr>
+              <w:tab/>
+            </w:r>
+            <w:r>
+              <w:rPr>
+                <w:rStyle w:val="Hyperlink"/>
+                <w:noProof/>
+              </w:rPr>
+              <w:t>Non-Functional Requirements</w:t>
+            </w:r>
+            <w:r>
+              <w:rPr>
+                <w:noProof/>
+                <w:webHidden/>
+              </w:rPr>
+              <w:tab/>
+            </w:r>
+            <w:r>
+              <w:rPr>
+                <w:noProof/>
+                <w:webHidden/>
+              </w:rPr>
+              <w:fldChar w:fldCharType="begin"/>
+            </w:r>
+            <w:r>
+              <w:rPr>
+                <w:noProof/>
+                <w:webHidden/>
+              </w:rPr>
+              <w:instrText xml:space="preserve"> PAGEREF _Toc225677381 \h </w:instrText>
+            </w:r>
+            <w:r>
+              <w:rPr>
+                <w:noProof/>
+                <w:webHidden/>
+              </w:rPr>
+            </w:r>
+            <w:r>
+              <w:rPr>
+                <w:noProof/>
+                <w:webHidden/>
+              </w:rPr>
+              <w:fldChar w:fldCharType="separate"/>
+            </w:r>
+            <w:r>
+              <w:rPr>
+                <w:noProof/>
+                <w:webHidden/>
+              </w:rPr>
+              <w:t>3</w:t>
             </w:r>
             <w:r>
               <w:rPr>
@@ -491,7 +671,7 @@
               <w14:ligatures w14:val="standardContextual"/>
             </w:rPr>
           </w:pPr>
-          <w:hyperlink w:anchor="_Toc225674573" w:history="1">
+          <w:hyperlink w:anchor="_Toc225677382" w:history="1">
             <w:r>
               <w:rPr>
                 <w:rStyle w:val="Hyperlink"/>
@@ -535,7 +715,7 @@
                 <w:noProof/>
                 <w:webHidden/>
               </w:rPr>
-              <w:instrText xml:space="preserve"> PAGEREF _Toc225674573 \h </w:instrText>
+              <w:instrText xml:space="preserve"> PAGEREF _Toc225677382 \h </w:instrText>
             </w:r>
             <w:r>
               <w:rPr>
@@ -555,7 +735,7 @@
                 <w:noProof/>
                 <w:webHidden/>
               </w:rPr>
-              <w:t>2</w:t>
+              <w:t>4</w:t>
             </w:r>
             <w:r>
               <w:rPr>
@@ -580,7 +760,7 @@
               <w14:ligatures w14:val="standardContextual"/>
             </w:rPr>
           </w:pPr>
-          <w:hyperlink w:anchor="_Toc225674574" w:history="1">
+          <w:hyperlink w:anchor="_Toc225677383" w:history="1">
             <w:r>
               <w:rPr>
                 <w:rStyle w:val="Hyperlink"/>
@@ -607,7 +787,7 @@
                 <w:noProof/>
                 <w:webHidden/>
               </w:rPr>
-              <w:instrText xml:space="preserve"> PAGEREF _Toc225674574 \h </w:instrText>
+              <w:instrText xml:space="preserve"> PAGEREF _Toc225677383 \h </w:instrText>
             </w:r>
             <w:r>
               <w:rPr>
@@ -627,7 +807,7 @@
                 <w:noProof/>
                 <w:webHidden/>
               </w:rPr>
-              <w:t>2</w:t>
+              <w:t>4</w:t>
             </w:r>
             <w:r>
               <w:rPr>
@@ -652,7 +832,7 @@
               <w14:ligatures w14:val="standardContextual"/>
             </w:rPr>
           </w:pPr>
-          <w:hyperlink w:anchor="_Toc225674575" w:history="1">
+          <w:hyperlink w:anchor="_Toc225677384" w:history="1">
             <w:r>
               <w:rPr>
                 <w:rStyle w:val="Hyperlink"/>
@@ -679,7 +859,7 @@
                 <w:noProof/>
                 <w:webHidden/>
               </w:rPr>
-              <w:instrText xml:space="preserve"> PAGEREF _Toc225674575 \h </w:instrText>
+              <w:instrText xml:space="preserve"> PAGEREF _Toc225677384 \h </w:instrText>
             </w:r>
             <w:r>
               <w:rPr>
@@ -699,7 +879,7 @@
                 <w:noProof/>
                 <w:webHidden/>
               </w:rPr>
-              <w:t>2</w:t>
+              <w:t>4</w:t>
             </w:r>
             <w:r>
               <w:rPr>
@@ -725,7 +905,7 @@
               <w14:ligatures w14:val="standardContextual"/>
             </w:rPr>
           </w:pPr>
-          <w:hyperlink w:anchor="_Toc225674576" w:history="1">
+          <w:hyperlink w:anchor="_Toc225677385" w:history="1">
             <w:r>
               <w:rPr>
                 <w:rStyle w:val="Hyperlink"/>
@@ -769,7 +949,7 @@
                 <w:noProof/>
                 <w:webHidden/>
               </w:rPr>
-              <w:instrText xml:space="preserve"> PAGEREF _Toc225674576 \h </w:instrText>
+              <w:instrText xml:space="preserve"> PAGEREF _Toc225677385 \h </w:instrText>
             </w:r>
             <w:r>
               <w:rPr>
@@ -789,7 +969,7 @@
                 <w:noProof/>
                 <w:webHidden/>
               </w:rPr>
-              <w:t>2</w:t>
+              <w:t>4</w:t>
             </w:r>
             <w:r>
               <w:rPr>
@@ -814,7 +994,7 @@
               <w14:ligatures w14:val="standardContextual"/>
             </w:rPr>
           </w:pPr>
-          <w:hyperlink w:anchor="_Toc225674577" w:history="1">
+          <w:hyperlink w:anchor="_Toc225677386" w:history="1">
             <w:r>
               <w:rPr>
                 <w:rStyle w:val="Hyperlink"/>
@@ -841,7 +1021,7 @@
                 <w:noProof/>
                 <w:webHidden/>
               </w:rPr>
-              <w:instrText xml:space="preserve"> PAGEREF _Toc225674577 \h </w:instrText>
+              <w:instrText xml:space="preserve"> PAGEREF _Toc225677386 \h </w:instrText>
             </w:r>
             <w:r>
               <w:rPr>
@@ -861,7 +1041,7 @@
                 <w:noProof/>
                 <w:webHidden/>
               </w:rPr>
-              <w:t>2</w:t>
+              <w:t>5</w:t>
             </w:r>
             <w:r>
               <w:rPr>
@@ -886,7 +1066,7 @@
               <w14:ligatures w14:val="standardContextual"/>
             </w:rPr>
           </w:pPr>
-          <w:hyperlink w:anchor="_Toc225674578" w:history="1">
+          <w:hyperlink w:anchor="_Toc225677387" w:history="1">
             <w:r>
               <w:rPr>
                 <w:rStyle w:val="Hyperlink"/>
@@ -913,7 +1093,7 @@
                 <w:noProof/>
                 <w:webHidden/>
               </w:rPr>
-              <w:instrText xml:space="preserve"> PAGEREF _Toc225674578 \h </w:instrText>
+              <w:instrText xml:space="preserve"> PAGEREF _Toc225677387 \h </w:instrText>
             </w:r>
             <w:r>
               <w:rPr>
@@ -933,7 +1113,7 @@
                 <w:noProof/>
                 <w:webHidden/>
               </w:rPr>
-              <w:t>2</w:t>
+              <w:t>5</w:t>
             </w:r>
             <w:r>
               <w:rPr>
@@ -959,7 +1139,7 @@
               <w14:ligatures w14:val="standardContextual"/>
             </w:rPr>
           </w:pPr>
-          <w:hyperlink w:anchor="_Toc225674579" w:history="1">
+          <w:hyperlink w:anchor="_Toc225677388" w:history="1">
             <w:r>
               <w:rPr>
                 <w:rStyle w:val="Hyperlink"/>
@@ -1003,7 +1183,7 @@
                 <w:noProof/>
                 <w:webHidden/>
               </w:rPr>
-              <w:instrText xml:space="preserve"> PAGEREF _Toc225674579 \h </w:instrText>
+              <w:instrText xml:space="preserve"> PAGEREF _Toc225677388 \h </w:instrText>
             </w:r>
             <w:r>
               <w:rPr>
@@ -1023,7 +1203,7 @@
                 <w:noProof/>
                 <w:webHidden/>
               </w:rPr>
-              <w:t>2</w:t>
+              <w:t>5</w:t>
             </w:r>
             <w:r>
               <w:rPr>
@@ -1048,7 +1228,7 @@
               <w14:ligatures w14:val="standardContextual"/>
             </w:rPr>
           </w:pPr>
-          <w:hyperlink w:anchor="_Toc225674580" w:history="1">
+          <w:hyperlink w:anchor="_Toc225677389" w:history="1">
             <w:r>
               <w:rPr>
                 <w:rStyle w:val="Hyperlink"/>
@@ -1075,7 +1255,7 @@
                 <w:noProof/>
                 <w:webHidden/>
               </w:rPr>
-              <w:instrText xml:space="preserve"> PAGEREF _Toc225674580 \h </w:instrText>
+              <w:instrText xml:space="preserve"> PAGEREF _Toc225677389 \h </w:instrText>
             </w:r>
             <w:r>
               <w:rPr>
@@ -1095,7 +1275,7 @@
                 <w:noProof/>
                 <w:webHidden/>
               </w:rPr>
-              <w:t>3</w:t>
+              <w:t>5</w:t>
             </w:r>
             <w:r>
               <w:rPr>
@@ -1120,7 +1300,7 @@
               <w14:ligatures w14:val="standardContextual"/>
             </w:rPr>
           </w:pPr>
-          <w:hyperlink w:anchor="_Toc225674581" w:history="1">
+          <w:hyperlink w:anchor="_Toc225677390" w:history="1">
             <w:r>
               <w:rPr>
                 <w:rStyle w:val="Hyperlink"/>
@@ -1147,7 +1327,7 @@
                 <w:noProof/>
                 <w:webHidden/>
               </w:rPr>
-              <w:instrText xml:space="preserve"> PAGEREF _Toc225674581 \h </w:instrText>
+              <w:instrText xml:space="preserve"> PAGEREF _Toc225677390 \h </w:instrText>
             </w:r>
             <w:r>
               <w:rPr>
@@ -1167,7 +1347,7 @@
                 <w:noProof/>
                 <w:webHidden/>
               </w:rPr>
-              <w:t>3</w:t>
+              <w:t>5</w:t>
             </w:r>
             <w:r>
               <w:rPr>
@@ -1193,7 +1373,7 @@
               <w14:ligatures w14:val="standardContextual"/>
             </w:rPr>
           </w:pPr>
-          <w:hyperlink w:anchor="_Toc225674582" w:history="1">
+          <w:hyperlink w:anchor="_Toc225677391" w:history="1">
             <w:r>
               <w:rPr>
                 <w:rStyle w:val="Hyperlink"/>
@@ -1237,7 +1417,7 @@
                 <w:noProof/>
                 <w:webHidden/>
               </w:rPr>
-              <w:instrText xml:space="preserve"> PAGEREF _Toc225674582 \h </w:instrText>
+              <w:instrText xml:space="preserve"> PAGEREF _Toc225677391 \h </w:instrText>
             </w:r>
             <w:r>
               <w:rPr>
@@ -1257,7 +1437,7 @@
                 <w:noProof/>
                 <w:webHidden/>
               </w:rPr>
-              <w:t>3</w:t>
+              <w:t>5</w:t>
             </w:r>
             <w:r>
               <w:rPr>
@@ -1283,7 +1463,7 @@
               <w14:ligatures w14:val="standardContextual"/>
             </w:rPr>
           </w:pPr>
-          <w:hyperlink w:anchor="_Toc225674583" w:history="1">
+          <w:hyperlink w:anchor="_Toc225677392" w:history="1">
             <w:r>
               <w:rPr>
                 <w:rStyle w:val="Hyperlink"/>
@@ -1327,7 +1507,7 @@
                 <w:noProof/>
                 <w:webHidden/>
               </w:rPr>
-              <w:instrText xml:space="preserve"> PAGEREF _Toc225674583 \h </w:instrText>
+              <w:instrText xml:space="preserve"> PAGEREF _Toc225677392 \h </w:instrText>
             </w:r>
             <w:r>
               <w:rPr>
@@ -1347,7 +1527,7 @@
                 <w:noProof/>
                 <w:webHidden/>
               </w:rPr>
-              <w:t>3</w:t>
+              <w:t>5</w:t>
             </w:r>
             <w:r>
               <w:rPr>
@@ -1373,7 +1553,7 @@
               <w14:ligatures w14:val="standardContextual"/>
             </w:rPr>
           </w:pPr>
-          <w:hyperlink w:anchor="_Toc225674584" w:history="1">
+          <w:hyperlink w:anchor="_Toc225677393" w:history="1">
             <w:r>
               <w:rPr>
                 <w:rStyle w:val="Hyperlink"/>
@@ -1417,7 +1597,7 @@
                 <w:noProof/>
                 <w:webHidden/>
               </w:rPr>
-              <w:instrText xml:space="preserve"> PAGEREF _Toc225674584 \h </w:instrText>
+              <w:instrText xml:space="preserve"> PAGEREF _Toc225677393 \h </w:instrText>
             </w:r>
             <w:r>
               <w:rPr>
@@ -1437,7 +1617,7 @@
                 <w:noProof/>
                 <w:webHidden/>
               </w:rPr>
-              <w:t>3</w:t>
+              <w:t>6</w:t>
             </w:r>
             <w:r>
               <w:rPr>
@@ -1463,7 +1643,7 @@
               <w14:ligatures w14:val="standardContextual"/>
             </w:rPr>
           </w:pPr>
-          <w:hyperlink w:anchor="_Toc225674585" w:history="1">
+          <w:hyperlink w:anchor="_Toc225677394" w:history="1">
             <w:r>
               <w:rPr>
                 <w:rStyle w:val="Hyperlink"/>
@@ -1507,7 +1687,7 @@
                 <w:noProof/>
                 <w:webHidden/>
               </w:rPr>
-              <w:instrText xml:space="preserve"> PAGEREF _Toc225674585 \h </w:instrText>
+              <w:instrText xml:space="preserve"> PAGEREF _Toc225677394 \h </w:instrText>
             </w:r>
             <w:r>
               <w:rPr>
@@ -1527,7 +1707,7 @@
                 <w:noProof/>
                 <w:webHidden/>
               </w:rPr>
-              <w:t>3</w:t>
+              <w:t>6</w:t>
             </w:r>
             <w:r>
               <w:rPr>
@@ -1552,27 +1732,13 @@
               <w14:ligatures w14:val="standardContextual"/>
             </w:rPr>
           </w:pPr>
-          <w:hyperlink w:anchor="_Toc225674586" w:history="1">
+          <w:hyperlink w:anchor="_Toc225677395" w:history="1">
             <w:r>
               <w:rPr>
                 <w:rStyle w:val="Hyperlink"/>
                 <w:noProof/>
               </w:rPr>
-              <w:t xml:space="preserve">Appendix A. </w:t>
-            </w:r>
-            <w:r>
-              <w:rPr>
-                <w:rStyle w:val="Hyperlink"/>
-                <w:noProof/>
-              </w:rPr>
-              <w:t>P</w:t>
-            </w:r>
-            <w:r>
-              <w:rPr>
-                <w:rStyle w:val="Hyperlink"/>
-                <w:noProof/>
-              </w:rPr>
-              <w:t>resentation Slides</w:t>
+              <w:t>Appendix A. Presentation Slides</w:t>
             </w:r>
             <w:r>
               <w:rPr>
@@ -1593,7 +1759,7 @@
                 <w:noProof/>
                 <w:webHidden/>
               </w:rPr>
-              <w:instrText xml:space="preserve"> PAGEREF _Toc225674586 \h </w:instrText>
+              <w:instrText xml:space="preserve"> PAGEREF _Toc225677395 \h </w:instrText>
             </w:r>
             <w:r>
               <w:rPr>
@@ -1613,7 +1779,7 @@
                 <w:noProof/>
                 <w:webHidden/>
               </w:rPr>
-              <w:t>5</w:t>
+              <w:t>8</w:t>
             </w:r>
             <w:r>
               <w:rPr>
@@ -1659,7 +1825,7 @@
           <w:numId w:val="1"/>
         </w:numPr>
       </w:pPr>
-      <w:bookmarkStart w:id="0" w:name="_Toc225674571"/>
+      <w:bookmarkStart w:id="0" w:name="_Toc225677378"/>
       <w:r>
         <w:lastRenderedPageBreak/>
         <w:t>Introduction</w:t>
@@ -1742,13 +1908,312 @@
           <w:numId w:val="1"/>
         </w:numPr>
       </w:pPr>
-      <w:bookmarkStart w:id="2" w:name="_Toc225674572"/>
+      <w:bookmarkStart w:id="2" w:name="_Toc225677379"/>
       <w:r>
         <w:t>Final Software Requirements Specification (SRS)</w:t>
       </w:r>
       <w:bookmarkEnd w:id="2"/>
     </w:p>
+    <w:p>
+      <w:r>
+        <w:t xml:space="preserve">This chapter presents the final Software Requirements Specification (SRS) for </w:t>
+      </w:r>
+      <w:proofErr w:type="spellStart"/>
+      <w:r>
+        <w:t>SmartBudget</w:t>
+      </w:r>
+      <w:proofErr w:type="spellEnd"/>
+      <w:r>
+        <w:t xml:space="preserve"> – Personal Finance Tracker. The purpose of this chapter is to define the final functional and non-functional requirements of the system in a clear and organized way, and to ensure that these requirements match the completed version of the software. In accordance with the final deliverable requirements, this SRS reflects the implemented features of </w:t>
+      </w:r>
+      <w:proofErr w:type="spellStart"/>
+      <w:r>
+        <w:t>SmartBudget</w:t>
+      </w:r>
+      <w:proofErr w:type="spellEnd"/>
+      <w:r>
+        <w:t xml:space="preserve"> and incorporates the refinements made during development so that the documented scope remains aligned with the final system.</w:t>
+      </w:r>
+    </w:p>
+    <w:p>
+      <w:proofErr w:type="spellStart"/>
+      <w:r>
+        <w:t>SmartBudget</w:t>
+      </w:r>
+      <w:proofErr w:type="spellEnd"/>
+      <w:r>
+        <w:t xml:space="preserve"> is a desktop-based personal finance application designed to help users record and manage daily financial activity, plan monthly budgets, receive overspending alerts, and review summary reports. The system is intended to provide a simple and practical way for users to understand their income and expenses through a clear interface and core financial tracking features. The final version of the system preserves the main scope established earlier in the project while bringing the features together into a complete and integrated application.</w:t>
+      </w:r>
+    </w:p>
+    <w:p>
+      <w:pPr>
+        <w:pStyle w:val="Heading2"/>
+        <w:numPr>
+          <w:ilvl w:val="1"/>
+          <w:numId w:val="1"/>
+        </w:numPr>
+      </w:pPr>
+      <w:bookmarkStart w:id="3" w:name="_Toc215431676"/>
+      <w:bookmarkStart w:id="4" w:name="_Toc225677380"/>
+      <w:r>
+        <w:t>Functional Requirements</w:t>
+      </w:r>
+      <w:bookmarkEnd w:id="3"/>
+      <w:bookmarkEnd w:id="4"/>
+    </w:p>
+    <w:p>
+      <w:r>
+        <w:t xml:space="preserve">The final functional requirements of </w:t>
+      </w:r>
+      <w:proofErr w:type="spellStart"/>
+      <w:r>
+        <w:t>SmartBudget</w:t>
+      </w:r>
+      <w:proofErr w:type="spellEnd"/>
+      <w:r>
+        <w:t xml:space="preserve"> are as follows:</w:t>
+      </w:r>
+    </w:p>
+    <w:p>
+      <w:pPr>
+        <w:pStyle w:val="ListParagraph"/>
+        <w:ind w:left="1287"/>
+      </w:pPr>
+      <w:r>
+        <w:rPr>
+          <w:b/>
+        </w:rPr>
+        <w:t>FR1 – Transactions:</w:t>
+      </w:r>
+      <w:r>
+        <w:t xml:space="preserve"> </w:t>
+      </w:r>
+      <w:r>
+        <w:t>The system must let the user record, edit, and delete income and expense transactions (amount, date, category, optional note), and persist them locally so they remain available across sessions.</w:t>
+      </w:r>
+    </w:p>
+    <w:p>
+      <w:pPr>
+        <w:pStyle w:val="ListParagraph"/>
+        <w:ind w:left="1287"/>
+      </w:pPr>
+      <w:r>
+        <w:rPr>
+          <w:b/>
+        </w:rPr>
+        <w:t>FR2 – Browsing &amp; Filters:</w:t>
+      </w:r>
+      <w:r>
+        <w:t xml:space="preserve"> </w:t>
+      </w:r>
+      <w:r>
+        <w:t>The system must let the user view transactions and apply filters (e.g., by date range and category) to review specific spending.</w:t>
+      </w:r>
+    </w:p>
+    <w:p>
+      <w:pPr>
+        <w:pStyle w:val="ListParagraph"/>
+        <w:ind w:left="1287"/>
+      </w:pPr>
+      <w:r>
+        <w:rPr>
+          <w:b/>
+        </w:rPr>
+        <w:t>FR3 – Budgets &amp; Alerts:</w:t>
+      </w:r>
+      <w:r>
+        <w:t xml:space="preserve"> </w:t>
+      </w:r>
+      <w:r>
+        <w:t>The system must let the user set a monthly spending limit per category and notify the user when spending reaches or exceeds that limit.</w:t>
+      </w:r>
+    </w:p>
+    <w:p>
+      <w:pPr>
+        <w:pStyle w:val="ListParagraph"/>
+        <w:ind w:left="1287"/>
+      </w:pPr>
+      <w:r>
+        <w:rPr>
+          <w:b/>
+        </w:rPr>
+        <w:lastRenderedPageBreak/>
+        <w:t>FR4 – Summaries &amp; Charts:</w:t>
+      </w:r>
+      <w:r>
+        <w:t xml:space="preserve"> </w:t>
+      </w:r>
+      <w:r>
+        <w:t>The system must provide a period summary (income, expenses, balance) and at least one visual breakdown of spending by category.</w:t>
+      </w:r>
+    </w:p>
+    <w:p>
+      <w:r>
+        <w:t xml:space="preserve">Together, these functional requirements define the core </w:t>
+      </w:r>
+      <w:proofErr w:type="spellStart"/>
+      <w:r>
+        <w:t>behavior</w:t>
+      </w:r>
+      <w:proofErr w:type="spellEnd"/>
+      <w:r>
+        <w:t xml:space="preserve"> of </w:t>
+      </w:r>
+      <w:proofErr w:type="spellStart"/>
+      <w:r>
+        <w:t>SmartBudget</w:t>
+      </w:r>
+      <w:proofErr w:type="spellEnd"/>
+      <w:r>
+        <w:t xml:space="preserve"> and reflect the main features that were carried from the earlier requirements stage into the completed system. The final implementation continues to follow this same feature scope, including transaction management, filtering, budgeting, alerts, reporting, and persistence across sessions.</w:t>
+      </w:r>
+    </w:p>
+    <w:p>
+      <w:pPr>
+        <w:pStyle w:val="Heading2"/>
+        <w:numPr>
+          <w:ilvl w:val="1"/>
+          <w:numId w:val="1"/>
+        </w:numPr>
+      </w:pPr>
+      <w:bookmarkStart w:id="5" w:name="_p8qtdzx9xg5w" w:colFirst="0" w:colLast="0"/>
+      <w:bookmarkStart w:id="6" w:name="_Toc215431677"/>
+      <w:bookmarkStart w:id="7" w:name="_Toc225677381"/>
+      <w:bookmarkEnd w:id="5"/>
+      <w:r>
+        <w:t>Non-Functional Requirements</w:t>
+      </w:r>
+      <w:bookmarkEnd w:id="6"/>
+      <w:bookmarkEnd w:id="7"/>
+    </w:p>
+    <w:p>
+      <w:r>
+        <w:t xml:space="preserve">The final non-functional requirements of </w:t>
+      </w:r>
+      <w:proofErr w:type="spellStart"/>
+      <w:r>
+        <w:t>SmartBudget</w:t>
+      </w:r>
+      <w:proofErr w:type="spellEnd"/>
+      <w:r>
+        <w:t xml:space="preserve"> are as follows:</w:t>
+      </w:r>
+    </w:p>
+    <w:p>
+      <w:pPr>
+        <w:pStyle w:val="ListParagraph"/>
+        <w:ind w:left="1287"/>
+      </w:pPr>
+      <w:r>
+        <w:rPr>
+          <w:b/>
+          <w:bCs/>
+        </w:rPr>
+        <w:t>Usability</w:t>
+      </w:r>
+      <w:r>
+        <w:t>: The system should present a simple, consistent JavaFX interface with clear labels, readable fonts, and sensible navigation between Transactions, Budgets, and Reports.</w:t>
+      </w:r>
+    </w:p>
+    <w:p>
+      <w:pPr>
+        <w:pStyle w:val="ListParagraph"/>
+        <w:ind w:left="1287"/>
+      </w:pPr>
+      <w:r>
+        <w:rPr>
+          <w:b/>
+          <w:bCs/>
+        </w:rPr>
+        <w:t>Performance</w:t>
+      </w:r>
+      <w:r>
+        <w:t>: The system should load typical datasets quickly and remain responsive during common operations.</w:t>
+      </w:r>
+    </w:p>
+    <w:p>
+      <w:pPr>
+        <w:pStyle w:val="ListParagraph"/>
+        <w:ind w:left="1287"/>
+      </w:pPr>
+      <w:r>
+        <w:rPr>
+          <w:b/>
+          <w:bCs/>
+        </w:rPr>
+        <w:t>Reliability</w:t>
+      </w:r>
+      <w:r>
+        <w:t>: The system should save changes immediately to local storage to minimize data loss and handle invalid inputs gracefully with clear feedback.</w:t>
+      </w:r>
+    </w:p>
+    <w:p>
+      <w:pPr>
+        <w:pStyle w:val="ListParagraph"/>
+        <w:ind w:left="1287"/>
+      </w:pPr>
+      <w:r>
+        <w:rPr>
+          <w:b/>
+          <w:bCs/>
+        </w:rPr>
+        <w:t>Privacy/Offline</w:t>
+      </w:r>
+      <w:r>
+        <w:t>: The system should operate fully offline and avoid sending data over a network.</w:t>
+      </w:r>
+    </w:p>
+    <w:p>
+      <w:pPr>
+        <w:pStyle w:val="ListParagraph"/>
+        <w:ind w:left="1287"/>
+      </w:pPr>
+      <w:r>
+        <w:rPr>
+          <w:b/>
+          <w:bCs/>
+        </w:rPr>
+        <w:t>Portability</w:t>
+      </w:r>
+      <w:r>
+        <w:t>: The system should run on Windows, macOS, and Linux with a supported Java runtime.</w:t>
+      </w:r>
+    </w:p>
+    <w:p>
+      <w:pPr>
+        <w:pStyle w:val="ListParagraph"/>
+        <w:ind w:left="1287"/>
+      </w:pPr>
+      <w:r>
+        <w:rPr>
+          <w:b/>
+          <w:bCs/>
+        </w:rPr>
+        <w:t>Maintainability</w:t>
+      </w:r>
+      <w:r>
+        <w:t>: The system should adopt a modular structure (e.g., MVC) and include unit tests for core business logic to enable straightforward updates.</w:t>
+      </w:r>
+    </w:p>
+    <w:p>
+      <w:r>
+        <w:t xml:space="preserve">These non-functional requirements define the expected quality of the </w:t>
+      </w:r>
+      <w:proofErr w:type="spellStart"/>
+      <w:r>
+        <w:t>SmartBudget</w:t>
+      </w:r>
+      <w:proofErr w:type="spellEnd"/>
+      <w:r>
+        <w:t xml:space="preserve"> system and remain important in the final version because they guide not only what the software does, but also how well it performs, how easy it is to use, and how reliably it behaves during normal operation.</w:t>
+      </w:r>
+    </w:p>
     <w:p/>
+    <w:p>
+      <w:r>
+        <w:t>These requirements are based on the earlier requirements analysis and were refined during development to align with the final implemented system.</w:t>
+      </w:r>
+    </w:p>
     <w:p>
       <w:pPr>
         <w:pStyle w:val="Heading1"/>
@@ -1757,13 +2222,40 @@
           <w:numId w:val="1"/>
         </w:numPr>
       </w:pPr>
-      <w:bookmarkStart w:id="3" w:name="_Toc225674573"/>
-      <w:r>
+      <w:bookmarkStart w:id="8" w:name="_Toc225677382"/>
+      <w:r>
+        <w:lastRenderedPageBreak/>
         <w:t>Final Software Design Document (SDD)</w:t>
       </w:r>
-      <w:bookmarkEnd w:id="3"/>
-    </w:p>
-    <w:p/>
+      <w:bookmarkEnd w:id="8"/>
+    </w:p>
+    <w:p>
+      <w:r>
+        <w:t xml:space="preserve">This chapter presents the final Software Design Document (SDD) for </w:t>
+      </w:r>
+      <w:proofErr w:type="spellStart"/>
+      <w:r>
+        <w:t>SmartBudget</w:t>
+      </w:r>
+      <w:proofErr w:type="spellEnd"/>
+      <w:r>
+        <w:t xml:space="preserve"> – Personal Finance Tracker. The purpose of this chapter is to describe the final design of the system and show how the software is organized to support the required functionality in a clear, maintainable, and testable way. </w:t>
+      </w:r>
+      <w:r>
+        <w:t>T</w:t>
+      </w:r>
+      <w:r>
+        <w:t xml:space="preserve">his chapter includes the architectural overview and the main design elements of the system, such as class diagrams, sequence diagrams, and activity diagrams, updated to reflect the final implemented state of </w:t>
+      </w:r>
+      <w:proofErr w:type="spellStart"/>
+      <w:r>
+        <w:t>SmartBudget</w:t>
+      </w:r>
+      <w:proofErr w:type="spellEnd"/>
+      <w:r>
+        <w:t>. Building on the earlier design work completed during the project, this chapter explains how the system’s layers, components, and key workflows fit together and how the design supports the completed features of transaction management, budgeting, overspending alerts, reporting, and persistent data handling.</w:t>
+      </w:r>
+    </w:p>
     <w:p>
       <w:pPr>
         <w:pStyle w:val="Heading2"/>
@@ -1772,8 +2264,8 @@
           <w:numId w:val="1"/>
         </w:numPr>
       </w:pPr>
-      <w:bookmarkStart w:id="4" w:name="_Toc225674574"/>
-      <w:bookmarkEnd w:id="4"/>
+      <w:bookmarkStart w:id="9" w:name="_Toc225677383"/>
+      <w:bookmarkEnd w:id="9"/>
     </w:p>
     <w:p/>
     <w:p>
@@ -1784,8 +2276,8 @@
           <w:numId w:val="1"/>
         </w:numPr>
       </w:pPr>
-      <w:bookmarkStart w:id="5" w:name="_Toc225674575"/>
-      <w:bookmarkEnd w:id="5"/>
+      <w:bookmarkStart w:id="10" w:name="_Toc225677384"/>
+      <w:bookmarkEnd w:id="10"/>
     </w:p>
     <w:p/>
     <w:p>
@@ -1796,13 +2288,33 @@
           <w:numId w:val="1"/>
         </w:numPr>
       </w:pPr>
-      <w:bookmarkStart w:id="6" w:name="_Toc225674576"/>
+      <w:bookmarkStart w:id="11" w:name="_Toc225677385"/>
       <w:r>
         <w:t>User Manual</w:t>
       </w:r>
-      <w:bookmarkEnd w:id="6"/>
-    </w:p>
-    <w:p/>
+      <w:bookmarkEnd w:id="11"/>
+    </w:p>
+    <w:p>
+      <w:r>
+        <w:t xml:space="preserve">This chapter presents the final testing documentation for </w:t>
+      </w:r>
+      <w:proofErr w:type="spellStart"/>
+      <w:r>
+        <w:t>SmartBudget</w:t>
+      </w:r>
+      <w:proofErr w:type="spellEnd"/>
+      <w:r>
+        <w:t xml:space="preserve"> – Personal Finance Tracker. The purpose of this chapter is to show how the completed system was validated and to provide clear evidence of its correctness, reliability, and overall readiness as a finished software product. This chapter brings together the testing methodology used for the project, the test cases prepared and executed for the main system features, the resulting outcomes, and the available coverage evidence in one cohesive testing document. Building on the earlier testing plan and the later implementation-stage testing work, this chapter explains how </w:t>
+      </w:r>
+      <w:proofErr w:type="spellStart"/>
+      <w:r>
+        <w:t>SmartBudget</w:t>
+      </w:r>
+      <w:proofErr w:type="spellEnd"/>
+      <w:r>
+        <w:t xml:space="preserve"> was tested at both feature level and system level, including the validation of transactions, budgets, overspending alerts, reports, persistence, and integrated workflows across the application.</w:t>
+      </w:r>
+    </w:p>
     <w:p>
       <w:pPr>
         <w:pStyle w:val="Heading2"/>
@@ -1811,11 +2323,11 @@
           <w:numId w:val="1"/>
         </w:numPr>
       </w:pPr>
-      <w:bookmarkStart w:id="7" w:name="_Toc225674577"/>
-      <w:bookmarkEnd w:id="7"/>
-    </w:p>
-    <w:p>
-      <w:bookmarkStart w:id="8" w:name="_Toc223897773"/>
+      <w:bookmarkStart w:id="12" w:name="_Toc225677386"/>
+      <w:bookmarkEnd w:id="12"/>
+    </w:p>
+    <w:p>
+      <w:bookmarkStart w:id="13" w:name="_Toc223897773"/>
     </w:p>
     <w:p>
       <w:pPr>
@@ -1825,8 +2337,8 @@
           <w:numId w:val="1"/>
         </w:numPr>
       </w:pPr>
-      <w:bookmarkStart w:id="9" w:name="_Toc225674578"/>
-      <w:bookmarkEnd w:id="9"/>
+      <w:bookmarkStart w:id="14" w:name="_Toc225677387"/>
+      <w:bookmarkEnd w:id="14"/>
     </w:p>
     <w:p/>
     <w:p>
@@ -1837,14 +2349,34 @@
           <w:numId w:val="1"/>
         </w:numPr>
       </w:pPr>
-      <w:bookmarkStart w:id="10" w:name="_Toc225674579"/>
-      <w:bookmarkEnd w:id="8"/>
+      <w:bookmarkStart w:id="15" w:name="_Toc225677388"/>
+      <w:bookmarkEnd w:id="13"/>
       <w:r>
         <w:t>User Manual</w:t>
       </w:r>
-      <w:bookmarkEnd w:id="10"/>
-    </w:p>
-    <w:p/>
+      <w:bookmarkEnd w:id="15"/>
+    </w:p>
+    <w:p>
+      <w:r>
+        <w:t xml:space="preserve">This chapter presents the user manual for </w:t>
+      </w:r>
+      <w:proofErr w:type="spellStart"/>
+      <w:r>
+        <w:t>SmartBudget</w:t>
+      </w:r>
+      <w:proofErr w:type="spellEnd"/>
+      <w:r>
+        <w:t xml:space="preserve"> – Personal Finance Tracker. The purpose of this chapter is to guide end users in understanding, setting up, and using the software effectively through clear and practical instructions. It explains the purpose of the system, the main features available to users, and the steps required to operate the application in everyday use. This chapter also provides guidance on installation and setup, navigation through the main screens, the use of core features such as transactions, budgets, alerts, reports, and saved data handling, as well as troubleshooting support and frequently asked questions. Overall, this chapter is intended to help users interact with </w:t>
+      </w:r>
+      <w:proofErr w:type="spellStart"/>
+      <w:r>
+        <w:t>SmartBudget</w:t>
+      </w:r>
+      <w:proofErr w:type="spellEnd"/>
+      <w:r>
+        <w:t xml:space="preserve"> confidently and use its features in a simple, efficient, and reliable way.</w:t>
+      </w:r>
+    </w:p>
     <w:p>
       <w:pPr>
         <w:pStyle w:val="Heading2"/>
@@ -1853,13 +2385,13 @@
           <w:numId w:val="1"/>
         </w:numPr>
       </w:pPr>
-      <w:bookmarkStart w:id="11" w:name="_Toc223897777"/>
-      <w:bookmarkStart w:id="12" w:name="_Toc225674580"/>
-      <w:bookmarkEnd w:id="12"/>
-    </w:p>
-    <w:p>
-      <w:bookmarkStart w:id="13" w:name="_Toc223897779"/>
-      <w:bookmarkEnd w:id="11"/>
+      <w:bookmarkStart w:id="16" w:name="_Toc223897777"/>
+      <w:bookmarkStart w:id="17" w:name="_Toc225677389"/>
+      <w:bookmarkEnd w:id="17"/>
+    </w:p>
+    <w:p>
+      <w:bookmarkStart w:id="18" w:name="_Toc223897779"/>
+      <w:bookmarkEnd w:id="16"/>
     </w:p>
     <w:p>
       <w:pPr>
@@ -1869,8 +2401,8 @@
           <w:numId w:val="1"/>
         </w:numPr>
       </w:pPr>
-      <w:bookmarkStart w:id="14" w:name="_Toc225674581"/>
-      <w:bookmarkEnd w:id="14"/>
+      <w:bookmarkStart w:id="19" w:name="_Toc225677390"/>
+      <w:bookmarkEnd w:id="19"/>
     </w:p>
     <w:p>
       <w:pPr>
@@ -1878,8 +2410,8 @@
       </w:pPr>
     </w:p>
     <w:p>
-      <w:bookmarkStart w:id="15" w:name="_Toc223897790"/>
-      <w:bookmarkEnd w:id="13"/>
+      <w:bookmarkStart w:id="20" w:name="_Toc223897790"/>
+      <w:bookmarkEnd w:id="18"/>
     </w:p>
     <w:p>
       <w:pPr>
@@ -1889,12 +2421,12 @@
           <w:numId w:val="1"/>
         </w:numPr>
       </w:pPr>
-      <w:bookmarkStart w:id="16" w:name="_Toc225674582"/>
+      <w:bookmarkStart w:id="21" w:name="_Toc225677391"/>
       <w:r>
         <w:t>Code Repository</w:t>
       </w:r>
-      <w:bookmarkEnd w:id="15"/>
-      <w:bookmarkEnd w:id="16"/>
+      <w:bookmarkEnd w:id="20"/>
+      <w:bookmarkEnd w:id="21"/>
       <w:r>
         <w:t xml:space="preserve"> </w:t>
       </w:r>
@@ -1920,13 +2452,13 @@
           <w:numId w:val="1"/>
         </w:numPr>
       </w:pPr>
-      <w:bookmarkStart w:id="17" w:name="_Toc223897791"/>
-      <w:bookmarkStart w:id="18" w:name="_Toc225674583"/>
+      <w:bookmarkStart w:id="22" w:name="_Toc223897791"/>
+      <w:bookmarkStart w:id="23" w:name="_Toc225677392"/>
       <w:r>
         <w:t>Repository Link:</w:t>
       </w:r>
-      <w:bookmarkEnd w:id="17"/>
-      <w:bookmarkEnd w:id="18"/>
+      <w:bookmarkEnd w:id="22"/>
+      <w:bookmarkEnd w:id="23"/>
     </w:p>
     <w:p>
       <w:r>
@@ -1946,6 +2478,7 @@
     </w:p>
     <w:p>
       <w:r>
+        <w:lastRenderedPageBreak/>
         <w:t>All project updates have been pushed to this repository.</w:t>
       </w:r>
     </w:p>
@@ -1957,13 +2490,13 @@
           <w:numId w:val="1"/>
         </w:numPr>
       </w:pPr>
-      <w:bookmarkStart w:id="19" w:name="_Toc223897792"/>
-      <w:bookmarkStart w:id="20" w:name="_Toc225674584"/>
+      <w:bookmarkStart w:id="24" w:name="_Toc223897792"/>
+      <w:bookmarkStart w:id="25" w:name="_Toc225677393"/>
       <w:r>
         <w:t>Submission Tag</w:t>
       </w:r>
-      <w:bookmarkEnd w:id="19"/>
-      <w:bookmarkEnd w:id="20"/>
+      <w:bookmarkEnd w:id="24"/>
+      <w:bookmarkEnd w:id="25"/>
     </w:p>
     <w:p>
       <w:pPr>
@@ -2009,15 +2542,14 @@
           <w:numId w:val="1"/>
         </w:numPr>
       </w:pPr>
-      <w:bookmarkStart w:id="21" w:name="_Toc223897793"/>
-      <w:bookmarkStart w:id="22" w:name="_Toc225674585"/>
+      <w:bookmarkStart w:id="26" w:name="_Toc223897793"/>
+      <w:bookmarkStart w:id="27" w:name="_Toc225677394"/>
       <w:r>
         <w:t>Conclusion</w:t>
       </w:r>
-      <w:bookmarkEnd w:id="21"/>
-      <w:bookmarkEnd w:id="22"/>
-    </w:p>
-    <w:p/>
+      <w:bookmarkEnd w:id="26"/>
+      <w:bookmarkEnd w:id="27"/>
+    </w:p>
     <w:p>
       <w:r>
         <w:t xml:space="preserve">This final report presents the completed </w:t>
@@ -2041,42 +2573,45 @@
     </w:p>
     <w:p>
       <w:r>
+        <w:t xml:space="preserve">The Software Requirements Specification chapter summarizes the final functional and non-functional requirements of </w:t>
+      </w:r>
+      <w:proofErr w:type="spellStart"/>
+      <w:r>
+        <w:t>SmartBudget</w:t>
+      </w:r>
+      <w:proofErr w:type="spellEnd"/>
+      <w:r>
+        <w:t xml:space="preserve"> and ensures that the implemented system remains aligned with the original project goals. The Software Design Document chapter then presents the final design of the system, including the architectural structure and the diagrams that describe how the main workflows and components are organized. Together, these chapters show that the project was developed in a structured way, with clear links between requirements, design, and implementation.</w:t>
+      </w:r>
+    </w:p>
+    <w:p>
+      <w:r>
+        <w:t xml:space="preserve">The testing chapter demonstrates that the final system was validated through a combination of test planning, functional testing, and integration testing. Earlier testing work established traceability between requirements and test cases, while later iterations expanded this into real execution results for transactions, budgets, alerts, reports, persistence, and full end-to-end workflows. As a result, the report shows that </w:t>
+      </w:r>
+      <w:proofErr w:type="spellStart"/>
+      <w:r>
+        <w:t>SmartBudget</w:t>
+      </w:r>
+      <w:proofErr w:type="spellEnd"/>
+      <w:r>
+        <w:t xml:space="preserve"> is not only </w:t>
+      </w:r>
+      <w:proofErr w:type="gramStart"/>
+      <w:r>
+        <w:t>implemented, but</w:t>
+      </w:r>
+      <w:proofErr w:type="gramEnd"/>
+      <w:r>
+        <w:t xml:space="preserve"> also tested in a way that supports confidence in its correctness, reliability, and overall readiness for submission.</w:t>
+      </w:r>
+    </w:p>
+    <w:p>
+      <w:r>
+        <w:t xml:space="preserve">The user manual chapter completes the report from the end-user perspective by explaining how to install, navigate, and use the software. This makes the final submission more than a technical report, because it also provides practical guidance for anyone who needs to </w:t>
+      </w:r>
+      <w:r>
         <w:lastRenderedPageBreak/>
-        <w:t xml:space="preserve">The Software Requirements Specification chapter summarizes the final functional and non-functional requirements of </w:t>
-      </w:r>
-      <w:proofErr w:type="spellStart"/>
-      <w:r>
-        <w:t>SmartBudget</w:t>
-      </w:r>
-      <w:proofErr w:type="spellEnd"/>
-      <w:r>
-        <w:t xml:space="preserve"> and ensures that the implemented system remains aligned with the original project goals. The Software Design Document chapter then presents the final design of the system, including the architectural structure and the diagrams that describe how the main workflows and components are organized. Together, these chapters show that the project was developed in a structured way, with clear links between requirements, design, and implementation.</w:t>
-      </w:r>
-    </w:p>
-    <w:p>
-      <w:r>
-        <w:t xml:space="preserve">The testing chapter demonstrates that the final system was validated through a combination of test planning, functional testing, and integration testing. Earlier testing work established traceability between requirements and test cases, while later iterations expanded this into real execution results for transactions, budgets, alerts, reports, persistence, and full end-to-end workflows. As a result, the report shows that </w:t>
-      </w:r>
-      <w:proofErr w:type="spellStart"/>
-      <w:r>
-        <w:t>SmartBudget</w:t>
-      </w:r>
-      <w:proofErr w:type="spellEnd"/>
-      <w:r>
-        <w:t xml:space="preserve"> is not only </w:t>
-      </w:r>
-      <w:proofErr w:type="gramStart"/>
-      <w:r>
-        <w:t>implemented, but</w:t>
-      </w:r>
-      <w:proofErr w:type="gramEnd"/>
-      <w:r>
-        <w:t xml:space="preserve"> also tested in a way that supports confidence in its correctness, reliability, and overall readiness for submission.</w:t>
-      </w:r>
-    </w:p>
-    <w:p>
-      <w:r>
-        <w:t>The user manual chapter completes the report from the end-user perspective by explaining how to install, navigate, and use the software. This makes the final submission more than a technical report, because it also provides practical guidance for anyone who needs to operate the application and understand its main features. The presentation slides included in the appendix further support the final submission by summarizing the project and its key outcomes in a format prepared for the final demonstration.</w:t>
+        <w:t>operate the application and understand its main features. The presentation slides included in the appendix further support the final submission by summarizing the project and its key outcomes in a format prepared for the final demonstration.</w:t>
       </w:r>
     </w:p>
     <w:p>
@@ -2105,12 +2640,12 @@
       <w:pPr>
         <w:pStyle w:val="Heading1"/>
       </w:pPr>
-      <w:bookmarkStart w:id="23" w:name="_Toc225674586"/>
+      <w:bookmarkStart w:id="28" w:name="_Toc225677395"/>
       <w:r>
         <w:lastRenderedPageBreak/>
         <w:t>Appendix A. Presentation Slides</w:t>
       </w:r>
-      <w:bookmarkEnd w:id="23"/>
+      <w:bookmarkEnd w:id="28"/>
     </w:p>
     <w:sectPr>
       <w:pgSz w:w="11909" w:h="16834"/>
@@ -5885,28 +6420,28 @@
 </file>
 
 <file path=customXml/item1.xml><?xml version="1.0" encoding="utf-8"?>
-<b:Sources xmlns:b="http://schemas.openxmlformats.org/officeDocument/2006/bibliography" xmlns="http://schemas.openxmlformats.org/officeDocument/2006/bibliography" SelectedStyle="\APASixthEditionOfficeOnline.xsl" StyleName="APA" Version="6"/>
-</file>
-
-<file path=customXml/item2.xml><?xml version="1.0" encoding="utf-8"?>
 <go:gDocsCustomXmlDataStorage xmlns:go="http://customooxmlschemas.google.com/" xmlns:r="http://schemas.openxmlformats.org/officeDocument/2006/relationships" uri="GoogleDocsCustomDataVersion2">
   <go:docsCustomData xmlns:go="http://customooxmlschemas.google.com/" roundtripDataSignature="AMtx7mj+cYpxvbAj8VZHbtgi8jccyeK9/g==">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</go:docsCustomData>
 </go:gDocsCustomXmlDataStorage>
 </file>
 
-<file path=customXml/itemProps1.xml><?xml version="1.0" encoding="utf-8"?>
-<ds:datastoreItem xmlns:ds="http://schemas.openxmlformats.org/officeDocument/2006/customXml" ds:itemID="{B215CC0E-34B4-4861-901B-CC3D2C8C3D51}">
-  <ds:schemaRefs>
-    <ds:schemaRef ds:uri="http://schemas.openxmlformats.org/officeDocument/2006/bibliography"/>
-  </ds:schemaRefs>
-</ds:datastoreItem>
+<file path=customXml/item2.xml><?xml version="1.0" encoding="utf-8"?>
+<b:Sources xmlns:b="http://schemas.openxmlformats.org/officeDocument/2006/bibliography" xmlns="http://schemas.openxmlformats.org/officeDocument/2006/bibliography" SelectedStyle="\APASixthEditionOfficeOnline.xsl" StyleName="APA" Version="6"/>
 </file>
 
-<file path=customXml/itemProps2.xml><?xml version="1.0" encoding="utf-8"?>
+<file path=customXml/itemProps1.xml><?xml version="1.0" encoding="utf-8"?>
 <ds:datastoreItem xmlns:ds="http://schemas.openxmlformats.org/officeDocument/2006/customXml" ds:itemID="{11111111-1234-1234-1234-123412341234}">
   <ds:schemaRefs>
     <ds:schemaRef ds:uri="http://customooxmlschemas.google.com/"/>
     <ds:schemaRef ds:uri="http://schemas.openxmlformats.org/officeDocument/2006/relationships"/>
   </ds:schemaRefs>
 </ds:datastoreItem>
+</file>
+
+<file path=customXml/itemProps2.xml><?xml version="1.0" encoding="utf-8"?>
+<ds:datastoreItem xmlns:ds="http://schemas.openxmlformats.org/officeDocument/2006/customXml" ds:itemID="{B215CC0E-34B4-4861-901B-CC3D2C8C3D51}">
+  <ds:schemaRefs>
+    <ds:schemaRef ds:uri="http://schemas.openxmlformats.org/officeDocument/2006/bibliography"/>
+  </ds:schemaRefs>
+</ds:datastoreItem>
 </file>
</xml_diff>